<commit_message>
Updated docs July 10 26
</commit_message>
<xml_diff>
--- a/d5_part2_of_dart_oop.docx
+++ b/d5_part2_of_dart_oop.docx
@@ -9619,17 +9619,7 @@
           <w:sz w:val="32"/>
           <w:szCs w:val="32"/>
         </w:rPr>
-        <w:t xml:space="preserve">  </w:t>
-      </w:r>
-      <w:r>
-        <w:rPr>
-          <w:b/>
-          <w:bCs/>
-          <w:color w:val="D86DCB" w:themeColor="accent5" w:themeTint="99"/>
-          <w:sz w:val="32"/>
-          <w:szCs w:val="32"/>
-        </w:rPr>
-        <w:t>String type = “Animal”;</w:t>
+        <w:t xml:space="preserve">  String type = “Animal”;</w:t>
       </w:r>
     </w:p>
     <w:p>
@@ -10497,23 +10487,22 @@
       <w:pPr>
         <w:jc w:val="both"/>
         <w:rPr>
-          <w:sz w:val="32"/>
-          <w:szCs w:val="32"/>
-        </w:rPr>
-      </w:pPr>
-      <w:r>
-        <w:rPr>
-          <w:sz w:val="32"/>
-          <w:szCs w:val="32"/>
-        </w:rPr>
-        <w:t>class C extends A, B {}</w:t>
-      </w:r>
-      <w:r>
-        <w:rPr>
-          <w:sz w:val="32"/>
-          <w:szCs w:val="32"/>
-        </w:rPr>
-        <w:t xml:space="preserve"> // wrong</w:t>
+          <w:b/>
+          <w:bCs/>
+          <w:color w:val="D86DCB" w:themeColor="accent5" w:themeTint="99"/>
+          <w:sz w:val="32"/>
+          <w:szCs w:val="32"/>
+        </w:rPr>
+      </w:pPr>
+      <w:r>
+        <w:rPr>
+          <w:b/>
+          <w:bCs/>
+          <w:color w:val="D86DCB" w:themeColor="accent5" w:themeTint="99"/>
+          <w:sz w:val="32"/>
+          <w:szCs w:val="32"/>
+        </w:rPr>
+        <w:t>class C extends A, B {} // wrong</w:t>
       </w:r>
     </w:p>
     <w:p>
@@ -10543,14 +10532,7 @@
           <w:sz w:val="32"/>
           <w:szCs w:val="32"/>
         </w:rPr>
-        <w:t xml:space="preserve"> Here,</w:t>
-      </w:r>
-      <w:r>
-        <w:rPr>
-          <w:sz w:val="32"/>
-          <w:szCs w:val="32"/>
-        </w:rPr>
-        <w:t xml:space="preserve"> </w:t>
+        <w:t xml:space="preserve"> Here, </w:t>
       </w:r>
       <w:r>
         <w:rPr>
@@ -10983,16 +10965,7 @@
           <w:sz w:val="32"/>
           <w:szCs w:val="32"/>
         </w:rPr>
-        <w:t>e</w:t>
-      </w:r>
-      <w:r>
-        <w:rPr>
-          <w:b/>
-          <w:bCs/>
-          <w:sz w:val="32"/>
-          <w:szCs w:val="32"/>
-        </w:rPr>
-        <w:t>xtends</w:t>
+        <w:t>extends</w:t>
       </w:r>
       <w:r>
         <w:rPr>
@@ -11137,16 +11110,7 @@
           <w:sz w:val="32"/>
           <w:szCs w:val="32"/>
         </w:rPr>
-        <w:t xml:space="preserve"> </w:t>
-      </w:r>
-      <w:r>
-        <w:rPr>
-          <w:b/>
-          <w:bCs/>
-          <w:sz w:val="32"/>
-          <w:szCs w:val="32"/>
-        </w:rPr>
-        <w:t>implements</w:t>
+        <w:t xml:space="preserve"> implements</w:t>
       </w:r>
       <w:r>
         <w:rPr>
@@ -16783,6 +16747,7 @@
   <w:style w:type="character" w:default="1" w:styleId="DefaultParagraphFont">
     <w:name w:val="Default Paragraph Font"/>
     <w:uiPriority w:val="1"/>
+    <w:semiHidden/>
     <w:unhideWhenUsed/>
   </w:style>
   <w:style w:type="table" w:default="1" w:styleId="TableNormal">

</xml_diff>

<commit_message>
Added Iterable in OOP and also added riverpod_lint rules for flutter analyze
</commit_message>
<xml_diff>
--- a/d5_part2_of_dart_oop.docx
+++ b/d5_part2_of_dart_oop.docx
@@ -678,14 +678,55 @@
           <w:sz w:val="32"/>
           <w:szCs w:val="32"/>
         </w:rPr>
-        <w:t>Primary Constructors (Experimental)………………………………</w:t>
-      </w:r>
-      <w:r>
-        <w:rPr>
-          <w:sz w:val="32"/>
-          <w:szCs w:val="32"/>
-        </w:rPr>
-        <w:t>.</w:t>
+        <w:t>Extending</w:t>
+      </w:r>
+      <w:r>
+        <w:rPr>
+          <w:b/>
+          <w:bCs/>
+          <w:sz w:val="32"/>
+          <w:szCs w:val="32"/>
+        </w:rPr>
+        <w:t xml:space="preserve"> </w:t>
+      </w:r>
+      <w:proofErr w:type="spellStart"/>
+      <w:r>
+        <w:rPr>
+          <w:b/>
+          <w:bCs/>
+          <w:sz w:val="32"/>
+          <w:szCs w:val="32"/>
+        </w:rPr>
+        <w:t>Iterable</w:t>
+      </w:r>
+      <w:proofErr w:type="spellEnd"/>
+      <w:r>
+        <w:rPr>
+          <w:sz w:val="32"/>
+          <w:szCs w:val="32"/>
+        </w:rPr>
+        <w:t xml:space="preserve"> Class…………………………………………….22</w:t>
+      </w:r>
+    </w:p>
+    <w:p>
+      <w:pPr>
+        <w:pStyle w:val="ListParagraph"/>
+        <w:numPr>
+          <w:ilvl w:val="0"/>
+          <w:numId w:val="1"/>
+        </w:numPr>
+        <w:jc w:val="both"/>
+        <w:rPr>
+          <w:sz w:val="32"/>
+          <w:szCs w:val="32"/>
+        </w:rPr>
+      </w:pPr>
+      <w:r>
+        <w:rPr>
+          <w:sz w:val="32"/>
+          <w:szCs w:val="32"/>
+        </w:rPr>
+        <w:t>Primary Constructors (Experimental)…………………………….</w:t>
       </w:r>
     </w:p>
     <w:p>
@@ -15082,6 +15123,1181 @@
           <w:sz w:val="32"/>
           <w:szCs w:val="32"/>
         </w:rPr>
+        <w:t xml:space="preserve">Extending </w:t>
+      </w:r>
+      <w:proofErr w:type="spellStart"/>
+      <w:r>
+        <w:rPr>
+          <w:b/>
+          <w:bCs/>
+          <w:sz w:val="32"/>
+          <w:szCs w:val="32"/>
+        </w:rPr>
+        <w:t>Iterable</w:t>
+      </w:r>
+      <w:proofErr w:type="spellEnd"/>
+      <w:r>
+        <w:rPr>
+          <w:b/>
+          <w:bCs/>
+          <w:sz w:val="32"/>
+          <w:szCs w:val="32"/>
+        </w:rPr>
+        <w:t xml:space="preserve"> Class:</w:t>
+      </w:r>
+    </w:p>
+    <w:p>
+      <w:pPr>
+        <w:jc w:val="both"/>
+        <w:rPr>
+          <w:sz w:val="32"/>
+          <w:szCs w:val="32"/>
+        </w:rPr>
+      </w:pPr>
+      <w:r>
+        <w:rPr>
+          <w:sz w:val="32"/>
+          <w:szCs w:val="32"/>
+        </w:rPr>
+        <w:t># We use</w:t>
+      </w:r>
+      <w:r>
+        <w:rPr>
+          <w:b/>
+          <w:bCs/>
+          <w:sz w:val="32"/>
+          <w:szCs w:val="32"/>
+        </w:rPr>
+        <w:t xml:space="preserve"> </w:t>
+      </w:r>
+      <w:proofErr w:type="spellStart"/>
+      <w:r>
+        <w:rPr>
+          <w:sz w:val="32"/>
+          <w:szCs w:val="32"/>
+        </w:rPr>
+        <w:t>i</w:t>
+      </w:r>
+      <w:r>
+        <w:rPr>
+          <w:sz w:val="32"/>
+          <w:szCs w:val="32"/>
+        </w:rPr>
+        <w:t>terable</w:t>
+      </w:r>
+      <w:r>
+        <w:rPr>
+          <w:sz w:val="32"/>
+          <w:szCs w:val="32"/>
+        </w:rPr>
+        <w:t>s</w:t>
+      </w:r>
+      <w:proofErr w:type="spellEnd"/>
+      <w:r>
+        <w:rPr>
+          <w:sz w:val="32"/>
+          <w:szCs w:val="32"/>
+        </w:rPr>
+        <w:t xml:space="preserve"> every day. In </w:t>
+      </w:r>
+      <w:r>
+        <w:rPr>
+          <w:b/>
+          <w:bCs/>
+          <w:sz w:val="32"/>
+          <w:szCs w:val="32"/>
+        </w:rPr>
+        <w:t>Dart</w:t>
+      </w:r>
+      <w:r>
+        <w:rPr>
+          <w:sz w:val="32"/>
+          <w:szCs w:val="32"/>
+        </w:rPr>
+        <w:t xml:space="preserve">, collections like </w:t>
+      </w:r>
+      <w:r>
+        <w:rPr>
+          <w:b/>
+          <w:bCs/>
+          <w:sz w:val="32"/>
+          <w:szCs w:val="32"/>
+        </w:rPr>
+        <w:t>List</w:t>
+      </w:r>
+      <w:r>
+        <w:rPr>
+          <w:sz w:val="32"/>
+          <w:szCs w:val="32"/>
+        </w:rPr>
+        <w:t xml:space="preserve">, </w:t>
+      </w:r>
+      <w:r>
+        <w:rPr>
+          <w:b/>
+          <w:bCs/>
+          <w:sz w:val="32"/>
+          <w:szCs w:val="32"/>
+        </w:rPr>
+        <w:t>Set</w:t>
+      </w:r>
+      <w:r>
+        <w:rPr>
+          <w:sz w:val="32"/>
+          <w:szCs w:val="32"/>
+        </w:rPr>
+        <w:t xml:space="preserve"> and anything else we can loop over (for loop) are </w:t>
+      </w:r>
+      <w:proofErr w:type="spellStart"/>
+      <w:r>
+        <w:rPr>
+          <w:sz w:val="32"/>
+          <w:szCs w:val="32"/>
+        </w:rPr>
+        <w:t>iterables</w:t>
+      </w:r>
+      <w:proofErr w:type="spellEnd"/>
+      <w:r>
+        <w:rPr>
+          <w:sz w:val="32"/>
+          <w:szCs w:val="32"/>
+        </w:rPr>
+        <w:t>.</w:t>
+      </w:r>
+    </w:p>
+    <w:p>
+      <w:pPr>
+        <w:jc w:val="both"/>
+        <w:rPr>
+          <w:sz w:val="32"/>
+          <w:szCs w:val="32"/>
+        </w:rPr>
+      </w:pPr>
+      <w:r>
+        <w:rPr>
+          <w:sz w:val="32"/>
+          <w:szCs w:val="32"/>
+        </w:rPr>
+        <w:t xml:space="preserve"># If we want our own custom class to have that same ability but without exposing data, use </w:t>
+      </w:r>
+      <w:proofErr w:type="spellStart"/>
+      <w:r>
+        <w:rPr>
+          <w:b/>
+          <w:bCs/>
+          <w:sz w:val="32"/>
+          <w:szCs w:val="32"/>
+        </w:rPr>
+        <w:t>Iterable</w:t>
+      </w:r>
+      <w:proofErr w:type="spellEnd"/>
+      <w:r>
+        <w:rPr>
+          <w:sz w:val="32"/>
+          <w:szCs w:val="32"/>
+        </w:rPr>
+        <w:t xml:space="preserve"> class. Without </w:t>
+      </w:r>
+      <w:proofErr w:type="spellStart"/>
+      <w:r>
+        <w:rPr>
+          <w:b/>
+          <w:bCs/>
+          <w:sz w:val="32"/>
+          <w:szCs w:val="32"/>
+        </w:rPr>
+        <w:t>Iterable</w:t>
+      </w:r>
+      <w:proofErr w:type="spellEnd"/>
+      <w:r>
+        <w:rPr>
+          <w:sz w:val="32"/>
+          <w:szCs w:val="32"/>
+        </w:rPr>
+        <w:t xml:space="preserve"> </w:t>
+      </w:r>
+      <w:r>
+        <w:rPr>
+          <w:sz w:val="32"/>
+          <w:szCs w:val="32"/>
+        </w:rPr>
+        <w:t xml:space="preserve">to loop over it </w:t>
+      </w:r>
+      <w:r>
+        <w:rPr>
+          <w:sz w:val="32"/>
+          <w:szCs w:val="32"/>
+        </w:rPr>
+        <w:t>we have to expose our list of letters using a getter method</w:t>
+      </w:r>
+    </w:p>
+    <w:p>
+      <w:pPr>
+        <w:jc w:val="both"/>
+        <w:rPr>
+          <w:b/>
+          <w:bCs/>
+          <w:color w:val="D86DCB" w:themeColor="accent5" w:themeTint="99"/>
+          <w:sz w:val="32"/>
+          <w:szCs w:val="32"/>
+        </w:rPr>
+      </w:pPr>
+      <w:r>
+        <w:rPr>
+          <w:b/>
+          <w:bCs/>
+          <w:color w:val="D86DCB" w:themeColor="accent5" w:themeTint="99"/>
+          <w:sz w:val="32"/>
+          <w:szCs w:val="32"/>
+        </w:rPr>
+        <w:t>class Letter {</w:t>
+      </w:r>
+    </w:p>
+    <w:p>
+      <w:pPr>
+        <w:jc w:val="both"/>
+        <w:rPr>
+          <w:b/>
+          <w:bCs/>
+          <w:color w:val="D86DCB" w:themeColor="accent5" w:themeTint="99"/>
+          <w:sz w:val="32"/>
+          <w:szCs w:val="32"/>
+        </w:rPr>
+      </w:pPr>
+      <w:r>
+        <w:rPr>
+          <w:b/>
+          <w:bCs/>
+          <w:color w:val="D86DCB" w:themeColor="accent5" w:themeTint="99"/>
+          <w:sz w:val="32"/>
+          <w:szCs w:val="32"/>
+        </w:rPr>
+        <w:t xml:space="preserve">  final String letter;</w:t>
+      </w:r>
+    </w:p>
+    <w:p>
+      <w:pPr>
+        <w:jc w:val="both"/>
+        <w:rPr>
+          <w:b/>
+          <w:bCs/>
+          <w:color w:val="D86DCB" w:themeColor="accent5" w:themeTint="99"/>
+          <w:sz w:val="32"/>
+          <w:szCs w:val="32"/>
+        </w:rPr>
+      </w:pPr>
+      <w:r>
+        <w:rPr>
+          <w:b/>
+          <w:bCs/>
+          <w:color w:val="D86DCB" w:themeColor="accent5" w:themeTint="99"/>
+          <w:sz w:val="32"/>
+          <w:szCs w:val="32"/>
+        </w:rPr>
+        <w:lastRenderedPageBreak/>
+        <w:t xml:space="preserve">  </w:t>
+      </w:r>
+      <w:proofErr w:type="gramStart"/>
+      <w:r>
+        <w:rPr>
+          <w:b/>
+          <w:bCs/>
+          <w:color w:val="D86DCB" w:themeColor="accent5" w:themeTint="99"/>
+          <w:sz w:val="32"/>
+          <w:szCs w:val="32"/>
+        </w:rPr>
+        <w:t>Letter(</w:t>
+      </w:r>
+      <w:proofErr w:type="gramEnd"/>
+      <w:r>
+        <w:rPr>
+          <w:b/>
+          <w:bCs/>
+          <w:color w:val="D86DCB" w:themeColor="accent5" w:themeTint="99"/>
+          <w:sz w:val="32"/>
+          <w:szCs w:val="32"/>
+        </w:rPr>
+        <w:t xml:space="preserve">{required </w:t>
+      </w:r>
+      <w:proofErr w:type="spellStart"/>
+      <w:r>
+        <w:rPr>
+          <w:b/>
+          <w:bCs/>
+          <w:color w:val="D86DCB" w:themeColor="accent5" w:themeTint="99"/>
+          <w:sz w:val="32"/>
+          <w:szCs w:val="32"/>
+        </w:rPr>
+        <w:t>this.letter</w:t>
+      </w:r>
+      <w:proofErr w:type="spellEnd"/>
+      <w:r>
+        <w:rPr>
+          <w:b/>
+          <w:bCs/>
+          <w:color w:val="D86DCB" w:themeColor="accent5" w:themeTint="99"/>
+          <w:sz w:val="32"/>
+          <w:szCs w:val="32"/>
+        </w:rPr>
+        <w:t>});</w:t>
+      </w:r>
+    </w:p>
+    <w:p>
+      <w:pPr>
+        <w:jc w:val="both"/>
+        <w:rPr>
+          <w:b/>
+          <w:bCs/>
+          <w:color w:val="D86DCB" w:themeColor="accent5" w:themeTint="99"/>
+          <w:sz w:val="32"/>
+          <w:szCs w:val="32"/>
+        </w:rPr>
+      </w:pPr>
+      <w:r>
+        <w:rPr>
+          <w:b/>
+          <w:bCs/>
+          <w:color w:val="D86DCB" w:themeColor="accent5" w:themeTint="99"/>
+          <w:sz w:val="32"/>
+          <w:szCs w:val="32"/>
+        </w:rPr>
+        <w:t>}</w:t>
+      </w:r>
+    </w:p>
+    <w:p>
+      <w:pPr>
+        <w:jc w:val="both"/>
+        <w:rPr>
+          <w:sz w:val="32"/>
+          <w:szCs w:val="32"/>
+        </w:rPr>
+      </w:pPr>
+      <w:r>
+        <w:rPr>
+          <w:sz w:val="32"/>
+          <w:szCs w:val="32"/>
+        </w:rPr>
+        <w:t>class Words {</w:t>
+      </w:r>
+    </w:p>
+    <w:p>
+      <w:pPr>
+        <w:jc w:val="both"/>
+        <w:rPr>
+          <w:sz w:val="32"/>
+          <w:szCs w:val="32"/>
+        </w:rPr>
+      </w:pPr>
+      <w:r>
+        <w:rPr>
+          <w:sz w:val="32"/>
+          <w:szCs w:val="32"/>
+        </w:rPr>
+        <w:t xml:space="preserve">  final List&lt;Letter&gt; _letters = [];</w:t>
+      </w:r>
+    </w:p>
+    <w:p>
+      <w:pPr>
+        <w:jc w:val="both"/>
+        <w:rPr>
+          <w:sz w:val="32"/>
+          <w:szCs w:val="32"/>
+        </w:rPr>
+      </w:pPr>
+      <w:r>
+        <w:rPr>
+          <w:sz w:val="32"/>
+          <w:szCs w:val="32"/>
+        </w:rPr>
+        <w:t xml:space="preserve">  </w:t>
+      </w:r>
+      <w:r>
+        <w:rPr>
+          <w:sz w:val="32"/>
+          <w:szCs w:val="32"/>
+        </w:rPr>
+        <w:t>List&lt;Letter&gt; get letters =&gt; _letters;</w:t>
+      </w:r>
+    </w:p>
+    <w:p>
+      <w:pPr>
+        <w:jc w:val="both"/>
+        <w:rPr>
+          <w:sz w:val="32"/>
+          <w:szCs w:val="32"/>
+        </w:rPr>
+      </w:pPr>
+      <w:r>
+        <w:rPr>
+          <w:sz w:val="32"/>
+          <w:szCs w:val="32"/>
+        </w:rPr>
+        <w:t>}</w:t>
+      </w:r>
+    </w:p>
+    <w:p>
+      <w:pPr>
+        <w:jc w:val="both"/>
+        <w:rPr>
+          <w:sz w:val="32"/>
+          <w:szCs w:val="32"/>
+        </w:rPr>
+      </w:pPr>
+      <w:r>
+        <w:rPr>
+          <w:sz w:val="32"/>
+          <w:szCs w:val="32"/>
+        </w:rPr>
+        <w:t># But inheriting the</w:t>
+      </w:r>
+      <w:r>
+        <w:rPr>
+          <w:b/>
+          <w:bCs/>
+          <w:sz w:val="32"/>
+          <w:szCs w:val="32"/>
+        </w:rPr>
+        <w:t xml:space="preserve"> </w:t>
+      </w:r>
+      <w:proofErr w:type="spellStart"/>
+      <w:r>
+        <w:rPr>
+          <w:b/>
+          <w:bCs/>
+          <w:sz w:val="32"/>
+          <w:szCs w:val="32"/>
+        </w:rPr>
+        <w:t>Iterable</w:t>
+      </w:r>
+      <w:proofErr w:type="spellEnd"/>
+      <w:r>
+        <w:rPr>
+          <w:sz w:val="32"/>
+          <w:szCs w:val="32"/>
+        </w:rPr>
+        <w:t xml:space="preserve"> class and overriding or implementing the </w:t>
+      </w:r>
+      <w:r>
+        <w:rPr>
+          <w:b/>
+          <w:bCs/>
+          <w:sz w:val="32"/>
+          <w:szCs w:val="32"/>
+        </w:rPr>
+        <w:t>iterator</w:t>
+      </w:r>
+      <w:r>
+        <w:rPr>
+          <w:sz w:val="32"/>
+          <w:szCs w:val="32"/>
+        </w:rPr>
+        <w:t xml:space="preserve"> getter property to that </w:t>
+      </w:r>
+      <w:proofErr w:type="gramStart"/>
+      <w:r>
+        <w:rPr>
+          <w:sz w:val="32"/>
+          <w:szCs w:val="32"/>
+        </w:rPr>
+        <w:t xml:space="preserve">lists </w:t>
+      </w:r>
+      <w:r>
+        <w:rPr>
+          <w:b/>
+          <w:bCs/>
+          <w:sz w:val="32"/>
+          <w:szCs w:val="32"/>
+        </w:rPr>
+        <w:t>.iterator</w:t>
+      </w:r>
+      <w:proofErr w:type="gramEnd"/>
+      <w:r>
+        <w:rPr>
+          <w:sz w:val="32"/>
+          <w:szCs w:val="32"/>
+        </w:rPr>
+        <w:t xml:space="preserve"> (since we’re wrapping a</w:t>
+      </w:r>
+      <w:r>
+        <w:rPr>
+          <w:b/>
+          <w:bCs/>
+          <w:sz w:val="32"/>
+          <w:szCs w:val="32"/>
+        </w:rPr>
+        <w:t xml:space="preserve"> List</w:t>
+      </w:r>
+      <w:r>
+        <w:rPr>
+          <w:sz w:val="32"/>
+          <w:szCs w:val="32"/>
+        </w:rPr>
+        <w:t xml:space="preserve">) we get </w:t>
+      </w:r>
+      <w:proofErr w:type="spellStart"/>
+      <w:r>
+        <w:rPr>
+          <w:sz w:val="32"/>
+          <w:szCs w:val="32"/>
+        </w:rPr>
+        <w:t>iterable</w:t>
+      </w:r>
+      <w:proofErr w:type="spellEnd"/>
+      <w:r>
+        <w:rPr>
+          <w:sz w:val="32"/>
+          <w:szCs w:val="32"/>
+        </w:rPr>
+        <w:t xml:space="preserve"> (loop over) functionality on the </w:t>
+      </w:r>
+      <w:r>
+        <w:rPr>
+          <w:b/>
+          <w:bCs/>
+          <w:sz w:val="32"/>
+          <w:szCs w:val="32"/>
+        </w:rPr>
+        <w:t>Word</w:t>
+      </w:r>
+      <w:r>
+        <w:rPr>
+          <w:sz w:val="32"/>
+          <w:szCs w:val="32"/>
+        </w:rPr>
+        <w:t xml:space="preserve"> class now. And also, a bunch of other </w:t>
+      </w:r>
+      <w:r>
+        <w:rPr>
+          <w:b/>
+          <w:bCs/>
+          <w:sz w:val="32"/>
+          <w:szCs w:val="32"/>
+        </w:rPr>
+        <w:t>List</w:t>
+      </w:r>
+      <w:r>
+        <w:rPr>
+          <w:sz w:val="32"/>
+          <w:szCs w:val="32"/>
+        </w:rPr>
+        <w:t xml:space="preserve"> properties like:</w:t>
+      </w:r>
+    </w:p>
+    <w:p>
+      <w:pPr>
+        <w:pStyle w:val="ListParagraph"/>
+        <w:numPr>
+          <w:ilvl w:val="0"/>
+          <w:numId w:val="9"/>
+        </w:numPr>
+        <w:jc w:val="both"/>
+        <w:rPr>
+          <w:b/>
+          <w:bCs/>
+          <w:sz w:val="32"/>
+          <w:szCs w:val="32"/>
+        </w:rPr>
+      </w:pPr>
+      <w:proofErr w:type="spellStart"/>
+      <w:proofErr w:type="gramStart"/>
+      <w:r>
+        <w:rPr>
+          <w:b/>
+          <w:bCs/>
+          <w:sz w:val="32"/>
+          <w:szCs w:val="32"/>
+        </w:rPr>
+        <w:t>words.first</w:t>
+      </w:r>
+      <w:proofErr w:type="spellEnd"/>
+      <w:proofErr w:type="gramEnd"/>
+    </w:p>
+    <w:p>
+      <w:pPr>
+        <w:pStyle w:val="ListParagraph"/>
+        <w:numPr>
+          <w:ilvl w:val="0"/>
+          <w:numId w:val="9"/>
+        </w:numPr>
+        <w:jc w:val="both"/>
+        <w:rPr>
+          <w:b/>
+          <w:bCs/>
+          <w:sz w:val="32"/>
+          <w:szCs w:val="32"/>
+        </w:rPr>
+      </w:pPr>
+      <w:proofErr w:type="spellStart"/>
+      <w:proofErr w:type="gramStart"/>
+      <w:r>
+        <w:rPr>
+          <w:b/>
+          <w:bCs/>
+          <w:sz w:val="32"/>
+          <w:szCs w:val="32"/>
+        </w:rPr>
+        <w:t>words.firstWhere</w:t>
+      </w:r>
+      <w:proofErr w:type="spellEnd"/>
+      <w:proofErr w:type="gramEnd"/>
+      <w:r>
+        <w:rPr>
+          <w:b/>
+          <w:bCs/>
+          <w:sz w:val="32"/>
+          <w:szCs w:val="32"/>
+        </w:rPr>
+        <w:t>()</w:t>
+      </w:r>
+    </w:p>
+    <w:p>
+      <w:pPr>
+        <w:pStyle w:val="ListParagraph"/>
+        <w:numPr>
+          <w:ilvl w:val="0"/>
+          <w:numId w:val="9"/>
+        </w:numPr>
+        <w:jc w:val="both"/>
+        <w:rPr>
+          <w:sz w:val="32"/>
+          <w:szCs w:val="32"/>
+        </w:rPr>
+      </w:pPr>
+      <w:proofErr w:type="spellStart"/>
+      <w:proofErr w:type="gramStart"/>
+      <w:r>
+        <w:rPr>
+          <w:b/>
+          <w:bCs/>
+          <w:sz w:val="32"/>
+          <w:szCs w:val="32"/>
+        </w:rPr>
+        <w:t>words.</w:t>
+      </w:r>
+      <w:r>
+        <w:rPr>
+          <w:b/>
+          <w:bCs/>
+          <w:sz w:val="32"/>
+          <w:szCs w:val="32"/>
+        </w:rPr>
+        <w:t>map</w:t>
+      </w:r>
+      <w:proofErr w:type="spellEnd"/>
+      <w:r>
+        <w:rPr>
+          <w:b/>
+          <w:bCs/>
+          <w:sz w:val="32"/>
+          <w:szCs w:val="32"/>
+        </w:rPr>
+        <w:t>(</w:t>
+      </w:r>
+      <w:proofErr w:type="gramEnd"/>
+      <w:r>
+        <w:rPr>
+          <w:b/>
+          <w:bCs/>
+          <w:sz w:val="32"/>
+          <w:szCs w:val="32"/>
+        </w:rPr>
+        <w:t>)</w:t>
+      </w:r>
+      <w:r>
+        <w:rPr>
+          <w:sz w:val="32"/>
+          <w:szCs w:val="32"/>
+        </w:rPr>
+        <w:t xml:space="preserve"> etc.</w:t>
+      </w:r>
+    </w:p>
+    <w:p>
+      <w:pPr>
+        <w:jc w:val="both"/>
+        <w:rPr>
+          <w:sz w:val="32"/>
+          <w:szCs w:val="32"/>
+        </w:rPr>
+      </w:pPr>
+      <w:r>
+        <w:rPr>
+          <w:sz w:val="32"/>
+          <w:szCs w:val="32"/>
+        </w:rPr>
+        <w:t xml:space="preserve"># Are accessible in </w:t>
+      </w:r>
+      <w:r>
+        <w:rPr>
+          <w:b/>
+          <w:bCs/>
+          <w:sz w:val="32"/>
+          <w:szCs w:val="32"/>
+        </w:rPr>
+        <w:t>Word</w:t>
+      </w:r>
+      <w:r>
+        <w:rPr>
+          <w:sz w:val="32"/>
+          <w:szCs w:val="32"/>
+        </w:rPr>
+        <w:t xml:space="preserve"> class now, all without exposing internal data</w:t>
+      </w:r>
+    </w:p>
+    <w:p>
+      <w:pPr>
+        <w:jc w:val="both"/>
+        <w:rPr>
+          <w:b/>
+          <w:bCs/>
+          <w:color w:val="D86DCB" w:themeColor="accent5" w:themeTint="99"/>
+          <w:sz w:val="32"/>
+          <w:szCs w:val="32"/>
+        </w:rPr>
+      </w:pPr>
+      <w:r>
+        <w:rPr>
+          <w:b/>
+          <w:bCs/>
+          <w:color w:val="D86DCB" w:themeColor="accent5" w:themeTint="99"/>
+          <w:sz w:val="32"/>
+          <w:szCs w:val="32"/>
+        </w:rPr>
+        <w:t xml:space="preserve">class Words extends </w:t>
+      </w:r>
+      <w:proofErr w:type="spellStart"/>
+      <w:r>
+        <w:rPr>
+          <w:b/>
+          <w:bCs/>
+          <w:color w:val="D86DCB" w:themeColor="accent5" w:themeTint="99"/>
+          <w:sz w:val="32"/>
+          <w:szCs w:val="32"/>
+        </w:rPr>
+        <w:t>Iterable</w:t>
+      </w:r>
+      <w:proofErr w:type="spellEnd"/>
+      <w:r>
+        <w:rPr>
+          <w:b/>
+          <w:bCs/>
+          <w:color w:val="D86DCB" w:themeColor="accent5" w:themeTint="99"/>
+          <w:sz w:val="32"/>
+          <w:szCs w:val="32"/>
+        </w:rPr>
+        <w:t>&lt;Letter&gt; {</w:t>
+      </w:r>
+    </w:p>
+    <w:p>
+      <w:pPr>
+        <w:jc w:val="both"/>
+        <w:rPr>
+          <w:b/>
+          <w:bCs/>
+          <w:color w:val="D86DCB" w:themeColor="accent5" w:themeTint="99"/>
+          <w:sz w:val="32"/>
+          <w:szCs w:val="32"/>
+        </w:rPr>
+      </w:pPr>
+      <w:r>
+        <w:rPr>
+          <w:b/>
+          <w:bCs/>
+          <w:color w:val="D86DCB" w:themeColor="accent5" w:themeTint="99"/>
+          <w:sz w:val="32"/>
+          <w:szCs w:val="32"/>
+        </w:rPr>
+        <w:t xml:space="preserve">  static final List&lt;Letter&gt; _letters = [];</w:t>
+      </w:r>
+    </w:p>
+    <w:p>
+      <w:pPr>
+        <w:jc w:val="both"/>
+        <w:rPr>
+          <w:b/>
+          <w:bCs/>
+          <w:color w:val="D86DCB" w:themeColor="accent5" w:themeTint="99"/>
+          <w:sz w:val="32"/>
+          <w:szCs w:val="32"/>
+        </w:rPr>
+      </w:pPr>
+      <w:r>
+        <w:rPr>
+          <w:b/>
+          <w:bCs/>
+          <w:color w:val="D86DCB" w:themeColor="accent5" w:themeTint="99"/>
+          <w:sz w:val="32"/>
+          <w:szCs w:val="32"/>
+        </w:rPr>
+        <w:t xml:space="preserve">  @override</w:t>
+      </w:r>
+    </w:p>
+    <w:p>
+      <w:pPr>
+        <w:jc w:val="both"/>
+        <w:rPr>
+          <w:b/>
+          <w:bCs/>
+          <w:color w:val="D86DCB" w:themeColor="accent5" w:themeTint="99"/>
+          <w:sz w:val="32"/>
+          <w:szCs w:val="32"/>
+        </w:rPr>
+      </w:pPr>
+      <w:r>
+        <w:rPr>
+          <w:b/>
+          <w:bCs/>
+          <w:color w:val="D86DCB" w:themeColor="accent5" w:themeTint="99"/>
+          <w:sz w:val="32"/>
+          <w:szCs w:val="32"/>
+        </w:rPr>
+        <w:t xml:space="preserve">  final iterator = _</w:t>
+      </w:r>
+      <w:proofErr w:type="spellStart"/>
+      <w:proofErr w:type="gramStart"/>
+      <w:r>
+        <w:rPr>
+          <w:b/>
+          <w:bCs/>
+          <w:color w:val="D86DCB" w:themeColor="accent5" w:themeTint="99"/>
+          <w:sz w:val="32"/>
+          <w:szCs w:val="32"/>
+        </w:rPr>
+        <w:t>letters.iterator</w:t>
+      </w:r>
+      <w:proofErr w:type="spellEnd"/>
+      <w:proofErr w:type="gramEnd"/>
+      <w:r>
+        <w:rPr>
+          <w:b/>
+          <w:bCs/>
+          <w:color w:val="D86DCB" w:themeColor="accent5" w:themeTint="99"/>
+          <w:sz w:val="32"/>
+          <w:szCs w:val="32"/>
+        </w:rPr>
+        <w:t>;</w:t>
+      </w:r>
+    </w:p>
+    <w:p>
+      <w:pPr>
+        <w:jc w:val="both"/>
+        <w:rPr>
+          <w:b/>
+          <w:bCs/>
+          <w:color w:val="D86DCB" w:themeColor="accent5" w:themeTint="99"/>
+          <w:sz w:val="32"/>
+          <w:szCs w:val="32"/>
+        </w:rPr>
+      </w:pPr>
+      <w:r>
+        <w:rPr>
+          <w:b/>
+          <w:bCs/>
+          <w:color w:val="D86DCB" w:themeColor="accent5" w:themeTint="99"/>
+          <w:sz w:val="32"/>
+          <w:szCs w:val="32"/>
+        </w:rPr>
+        <w:t>}</w:t>
+      </w:r>
+    </w:p>
+    <w:p>
+      <w:pPr>
+        <w:jc w:val="both"/>
+        <w:rPr>
+          <w:b/>
+          <w:bCs/>
+          <w:color w:val="D86DCB" w:themeColor="accent5" w:themeTint="99"/>
+          <w:sz w:val="32"/>
+          <w:szCs w:val="32"/>
+        </w:rPr>
+      </w:pPr>
+      <w:r>
+        <w:rPr>
+          <w:b/>
+          <w:bCs/>
+          <w:color w:val="D86DCB" w:themeColor="accent5" w:themeTint="99"/>
+          <w:sz w:val="32"/>
+          <w:szCs w:val="32"/>
+        </w:rPr>
+        <w:t>void main () async {</w:t>
+      </w:r>
+    </w:p>
+    <w:p>
+      <w:pPr>
+        <w:jc w:val="both"/>
+        <w:rPr>
+          <w:b/>
+          <w:bCs/>
+          <w:color w:val="D86DCB" w:themeColor="accent5" w:themeTint="99"/>
+          <w:sz w:val="32"/>
+          <w:szCs w:val="32"/>
+        </w:rPr>
+      </w:pPr>
+      <w:r>
+        <w:rPr>
+          <w:b/>
+          <w:bCs/>
+          <w:color w:val="D86DCB" w:themeColor="accent5" w:themeTint="99"/>
+          <w:sz w:val="32"/>
+          <w:szCs w:val="32"/>
+        </w:rPr>
+        <w:t xml:space="preserve">  final words = </w:t>
+      </w:r>
+      <w:proofErr w:type="gramStart"/>
+      <w:r>
+        <w:rPr>
+          <w:b/>
+          <w:bCs/>
+          <w:color w:val="D86DCB" w:themeColor="accent5" w:themeTint="99"/>
+          <w:sz w:val="32"/>
+          <w:szCs w:val="32"/>
+        </w:rPr>
+        <w:t>Words(</w:t>
+      </w:r>
+      <w:proofErr w:type="gramEnd"/>
+      <w:r>
+        <w:rPr>
+          <w:b/>
+          <w:bCs/>
+          <w:color w:val="D86DCB" w:themeColor="accent5" w:themeTint="99"/>
+          <w:sz w:val="32"/>
+          <w:szCs w:val="32"/>
+        </w:rPr>
+        <w:t>);</w:t>
+      </w:r>
+    </w:p>
+    <w:p>
+      <w:pPr>
+        <w:jc w:val="both"/>
+        <w:rPr>
+          <w:b/>
+          <w:bCs/>
+          <w:color w:val="D86DCB" w:themeColor="accent5" w:themeTint="99"/>
+          <w:sz w:val="32"/>
+          <w:szCs w:val="32"/>
+        </w:rPr>
+      </w:pPr>
+      <w:r>
+        <w:rPr>
+          <w:b/>
+          <w:bCs/>
+          <w:color w:val="D86DCB" w:themeColor="accent5" w:themeTint="99"/>
+          <w:sz w:val="32"/>
+          <w:szCs w:val="32"/>
+        </w:rPr>
+        <w:t xml:space="preserve">  </w:t>
+      </w:r>
+      <w:proofErr w:type="gramStart"/>
+      <w:r>
+        <w:rPr>
+          <w:b/>
+          <w:bCs/>
+          <w:color w:val="D86DCB" w:themeColor="accent5" w:themeTint="99"/>
+          <w:sz w:val="32"/>
+          <w:szCs w:val="32"/>
+        </w:rPr>
+        <w:t>for(</w:t>
+      </w:r>
+      <w:proofErr w:type="gramEnd"/>
+      <w:r>
+        <w:rPr>
+          <w:b/>
+          <w:bCs/>
+          <w:color w:val="D86DCB" w:themeColor="accent5" w:themeTint="99"/>
+          <w:sz w:val="32"/>
+          <w:szCs w:val="32"/>
+        </w:rPr>
+        <w:t>final letters in words) {</w:t>
+      </w:r>
+    </w:p>
+    <w:p>
+      <w:pPr>
+        <w:jc w:val="both"/>
+        <w:rPr>
+          <w:b/>
+          <w:bCs/>
+          <w:color w:val="D86DCB" w:themeColor="accent5" w:themeTint="99"/>
+          <w:sz w:val="32"/>
+          <w:szCs w:val="32"/>
+        </w:rPr>
+      </w:pPr>
+      <w:r>
+        <w:rPr>
+          <w:b/>
+          <w:bCs/>
+          <w:color w:val="D86DCB" w:themeColor="accent5" w:themeTint="99"/>
+          <w:sz w:val="32"/>
+          <w:szCs w:val="32"/>
+        </w:rPr>
+        <w:t xml:space="preserve">    print(letters);</w:t>
+      </w:r>
+    </w:p>
+    <w:p>
+      <w:pPr>
+        <w:jc w:val="both"/>
+        <w:rPr>
+          <w:b/>
+          <w:bCs/>
+          <w:color w:val="D86DCB" w:themeColor="accent5" w:themeTint="99"/>
+          <w:sz w:val="32"/>
+          <w:szCs w:val="32"/>
+        </w:rPr>
+      </w:pPr>
+      <w:r>
+        <w:rPr>
+          <w:b/>
+          <w:bCs/>
+          <w:color w:val="D86DCB" w:themeColor="accent5" w:themeTint="99"/>
+          <w:sz w:val="32"/>
+          <w:szCs w:val="32"/>
+        </w:rPr>
+        <w:lastRenderedPageBreak/>
+        <w:t xml:space="preserve">  }</w:t>
+      </w:r>
+    </w:p>
+    <w:p>
+      <w:pPr>
+        <w:jc w:val="both"/>
+        <w:rPr>
+          <w:b/>
+          <w:bCs/>
+          <w:color w:val="D86DCB" w:themeColor="accent5" w:themeTint="99"/>
+          <w:sz w:val="32"/>
+          <w:szCs w:val="32"/>
+        </w:rPr>
+      </w:pPr>
+      <w:r>
+        <w:rPr>
+          <w:b/>
+          <w:bCs/>
+          <w:color w:val="D86DCB" w:themeColor="accent5" w:themeTint="99"/>
+          <w:sz w:val="32"/>
+          <w:szCs w:val="32"/>
+        </w:rPr>
+        <w:t xml:space="preserve">  print(</w:t>
+      </w:r>
+      <w:proofErr w:type="spellStart"/>
+      <w:proofErr w:type="gramStart"/>
+      <w:r>
+        <w:rPr>
+          <w:b/>
+          <w:bCs/>
+          <w:color w:val="D86DCB" w:themeColor="accent5" w:themeTint="99"/>
+          <w:sz w:val="32"/>
+          <w:szCs w:val="32"/>
+        </w:rPr>
+        <w:t>words.first</w:t>
+      </w:r>
+      <w:proofErr w:type="spellEnd"/>
+      <w:proofErr w:type="gramEnd"/>
+      <w:r>
+        <w:rPr>
+          <w:b/>
+          <w:bCs/>
+          <w:color w:val="D86DCB" w:themeColor="accent5" w:themeTint="99"/>
+          <w:sz w:val="32"/>
+          <w:szCs w:val="32"/>
+        </w:rPr>
+        <w:t>);</w:t>
+      </w:r>
+    </w:p>
+    <w:p>
+      <w:pPr>
+        <w:jc w:val="both"/>
+        <w:rPr>
+          <w:b/>
+          <w:bCs/>
+          <w:color w:val="D86DCB" w:themeColor="accent5" w:themeTint="99"/>
+          <w:sz w:val="32"/>
+          <w:szCs w:val="32"/>
+        </w:rPr>
+      </w:pPr>
+      <w:r>
+        <w:rPr>
+          <w:b/>
+          <w:bCs/>
+          <w:color w:val="D86DCB" w:themeColor="accent5" w:themeTint="99"/>
+          <w:sz w:val="32"/>
+          <w:szCs w:val="32"/>
+        </w:rPr>
+        <w:t>}</w:t>
+      </w:r>
+    </w:p>
+    <w:p>
+      <w:pPr>
+        <w:jc w:val="both"/>
+        <w:rPr>
+          <w:sz w:val="32"/>
+          <w:szCs w:val="32"/>
+        </w:rPr>
+      </w:pPr>
+      <w:r>
+        <w:rPr>
+          <w:b/>
+          <w:bCs/>
+          <w:sz w:val="32"/>
+          <w:szCs w:val="32"/>
+        </w:rPr>
+        <w:t xml:space="preserve">NOTE: </w:t>
+      </w:r>
+      <w:r>
+        <w:rPr>
+          <w:sz w:val="32"/>
+          <w:szCs w:val="32"/>
+        </w:rPr>
+        <w:t>We can sure security or encapsulation using this trick</w:t>
+      </w:r>
+    </w:p>
+    <w:p>
+      <w:pPr>
+        <w:jc w:val="both"/>
+        <w:rPr>
+          <w:sz w:val="32"/>
+          <w:szCs w:val="32"/>
+        </w:rPr>
+      </w:pPr>
+    </w:p>
+    <w:p>
+      <w:pPr>
+        <w:jc w:val="center"/>
+        <w:rPr>
+          <w:sz w:val="32"/>
+          <w:szCs w:val="32"/>
+        </w:rPr>
+      </w:pPr>
+      <w:r>
+        <w:rPr>
+          <w:sz w:val="32"/>
+          <w:szCs w:val="32"/>
+        </w:rPr>
+        <w:t>Break</w:t>
+      </w:r>
+    </w:p>
+    <w:p>
+      <w:pPr>
+        <w:jc w:val="both"/>
+        <w:rPr>
+          <w:sz w:val="32"/>
+          <w:szCs w:val="32"/>
+        </w:rPr>
+      </w:pPr>
+    </w:p>
+    <w:p>
+      <w:pPr>
+        <w:jc w:val="both"/>
+        <w:rPr>
+          <w:b/>
+          <w:bCs/>
+          <w:sz w:val="32"/>
+          <w:szCs w:val="32"/>
+        </w:rPr>
+      </w:pPr>
+      <w:r>
+        <w:rPr>
+          <w:b/>
+          <w:bCs/>
+          <w:sz w:val="32"/>
+          <w:szCs w:val="32"/>
+        </w:rPr>
         <w:t>Primary Constructors (Experimental):</w:t>
       </w:r>
     </w:p>
@@ -15892,9 +17108,9 @@
     </w:lvl>
   </w:abstractNum>
   <w:abstractNum w:abstractNumId="6" w15:restartNumberingAfterBreak="0">
-    <w:nsid w:val="74C56C02"/>
+    <w:nsid w:val="62F655AF"/>
     <w:multiLevelType w:val="hybridMultilevel"/>
-    <w:tmpl w:val="B896FC4C"/>
+    <w:tmpl w:val="E3B67A84"/>
     <w:lvl w:ilvl="0" w:tplc="04090001">
       <w:start w:val="1"/>
       <w:numFmt w:val="bullet"/>
@@ -16005,6 +17221,119 @@
     </w:lvl>
   </w:abstractNum>
   <w:abstractNum w:abstractNumId="7" w15:restartNumberingAfterBreak="0">
+    <w:nsid w:val="74C56C02"/>
+    <w:multiLevelType w:val="hybridMultilevel"/>
+    <w:tmpl w:val="B896FC4C"/>
+    <w:lvl w:ilvl="0" w:tplc="04090001">
+      <w:start w:val="1"/>
+      <w:numFmt w:val="bullet"/>
+      <w:lvlText w:val=""/>
+      <w:lvlJc w:val="left"/>
+      <w:pPr>
+        <w:ind w:left="360" w:hanging="360"/>
+      </w:pPr>
+      <w:rPr>
+        <w:rFonts w:ascii="Symbol" w:hAnsi="Symbol" w:hint="default"/>
+      </w:rPr>
+    </w:lvl>
+    <w:lvl w:ilvl="1" w:tplc="04090003" w:tentative="1">
+      <w:start w:val="1"/>
+      <w:numFmt w:val="bullet"/>
+      <w:lvlText w:val="o"/>
+      <w:lvlJc w:val="left"/>
+      <w:pPr>
+        <w:ind w:left="1080" w:hanging="360"/>
+      </w:pPr>
+      <w:rPr>
+        <w:rFonts w:ascii="Courier New" w:hAnsi="Courier New" w:cs="Courier New" w:hint="default"/>
+      </w:rPr>
+    </w:lvl>
+    <w:lvl w:ilvl="2" w:tplc="04090005" w:tentative="1">
+      <w:start w:val="1"/>
+      <w:numFmt w:val="bullet"/>
+      <w:lvlText w:val=""/>
+      <w:lvlJc w:val="left"/>
+      <w:pPr>
+        <w:ind w:left="1800" w:hanging="360"/>
+      </w:pPr>
+      <w:rPr>
+        <w:rFonts w:ascii="Wingdings" w:hAnsi="Wingdings" w:hint="default"/>
+      </w:rPr>
+    </w:lvl>
+    <w:lvl w:ilvl="3" w:tplc="04090001" w:tentative="1">
+      <w:start w:val="1"/>
+      <w:numFmt w:val="bullet"/>
+      <w:lvlText w:val=""/>
+      <w:lvlJc w:val="left"/>
+      <w:pPr>
+        <w:ind w:left="2520" w:hanging="360"/>
+      </w:pPr>
+      <w:rPr>
+        <w:rFonts w:ascii="Symbol" w:hAnsi="Symbol" w:hint="default"/>
+      </w:rPr>
+    </w:lvl>
+    <w:lvl w:ilvl="4" w:tplc="04090003" w:tentative="1">
+      <w:start w:val="1"/>
+      <w:numFmt w:val="bullet"/>
+      <w:lvlText w:val="o"/>
+      <w:lvlJc w:val="left"/>
+      <w:pPr>
+        <w:ind w:left="3240" w:hanging="360"/>
+      </w:pPr>
+      <w:rPr>
+        <w:rFonts w:ascii="Courier New" w:hAnsi="Courier New" w:cs="Courier New" w:hint="default"/>
+      </w:rPr>
+    </w:lvl>
+    <w:lvl w:ilvl="5" w:tplc="04090005" w:tentative="1">
+      <w:start w:val="1"/>
+      <w:numFmt w:val="bullet"/>
+      <w:lvlText w:val=""/>
+      <w:lvlJc w:val="left"/>
+      <w:pPr>
+        <w:ind w:left="3960" w:hanging="360"/>
+      </w:pPr>
+      <w:rPr>
+        <w:rFonts w:ascii="Wingdings" w:hAnsi="Wingdings" w:hint="default"/>
+      </w:rPr>
+    </w:lvl>
+    <w:lvl w:ilvl="6" w:tplc="04090001" w:tentative="1">
+      <w:start w:val="1"/>
+      <w:numFmt w:val="bullet"/>
+      <w:lvlText w:val=""/>
+      <w:lvlJc w:val="left"/>
+      <w:pPr>
+        <w:ind w:left="4680" w:hanging="360"/>
+      </w:pPr>
+      <w:rPr>
+        <w:rFonts w:ascii="Symbol" w:hAnsi="Symbol" w:hint="default"/>
+      </w:rPr>
+    </w:lvl>
+    <w:lvl w:ilvl="7" w:tplc="04090003" w:tentative="1">
+      <w:start w:val="1"/>
+      <w:numFmt w:val="bullet"/>
+      <w:lvlText w:val="o"/>
+      <w:lvlJc w:val="left"/>
+      <w:pPr>
+        <w:ind w:left="5400" w:hanging="360"/>
+      </w:pPr>
+      <w:rPr>
+        <w:rFonts w:ascii="Courier New" w:hAnsi="Courier New" w:cs="Courier New" w:hint="default"/>
+      </w:rPr>
+    </w:lvl>
+    <w:lvl w:ilvl="8" w:tplc="04090005" w:tentative="1">
+      <w:start w:val="1"/>
+      <w:numFmt w:val="bullet"/>
+      <w:lvlText w:val=""/>
+      <w:lvlJc w:val="left"/>
+      <w:pPr>
+        <w:ind w:left="6120" w:hanging="360"/>
+      </w:pPr>
+      <w:rPr>
+        <w:rFonts w:ascii="Wingdings" w:hAnsi="Wingdings" w:hint="default"/>
+      </w:rPr>
+    </w:lvl>
+  </w:abstractNum>
+  <w:abstractNum w:abstractNumId="8" w15:restartNumberingAfterBreak="0">
     <w:nsid w:val="74E07733"/>
     <w:multiLevelType w:val="hybridMultilevel"/>
     <w:tmpl w:val="5FF2484C"/>
@@ -16124,13 +17453,13 @@
     <w:abstractNumId w:val="5"/>
   </w:num>
   <w:num w:numId="3" w16cid:durableId="379089940">
-    <w:abstractNumId w:val="7"/>
+    <w:abstractNumId w:val="8"/>
   </w:num>
   <w:num w:numId="4" w16cid:durableId="973482591">
     <w:abstractNumId w:val="3"/>
   </w:num>
   <w:num w:numId="5" w16cid:durableId="658195343">
-    <w:abstractNumId w:val="6"/>
+    <w:abstractNumId w:val="7"/>
   </w:num>
   <w:num w:numId="6" w16cid:durableId="1202790539">
     <w:abstractNumId w:val="1"/>
@@ -16140,6 +17469,9 @@
   </w:num>
   <w:num w:numId="8" w16cid:durableId="99764026">
     <w:abstractNumId w:val="2"/>
+  </w:num>
+  <w:num w:numId="9" w16cid:durableId="1540045940">
+    <w:abstractNumId w:val="6"/>
   </w:num>
 </w:numbering>
 </file>
@@ -16747,7 +18079,6 @@
   <w:style w:type="character" w:default="1" w:styleId="DefaultParagraphFont">
     <w:name w:val="Default Paragraph Font"/>
     <w:uiPriority w:val="1"/>
-    <w:semiHidden/>
     <w:unhideWhenUsed/>
   </w:style>
   <w:style w:type="table" w:default="1" w:styleId="TableNormal">

</xml_diff>